<commit_message>
fix: resolve LaTeX build errors and save project state
</commit_message>
<xml_diff>
--- a/report.docx
+++ b/report.docx
@@ -218,7 +218,23 @@
                 <w:sz w:val="26"/>
                 <w:szCs w:val="26"/>
               </w:rPr>
-              <w:t>2D FFT cho ảnh xám 64x64</w:t>
+              <w:t xml:space="preserve">2D FFT cho ảnh </w:t>
+            </w:r>
+            <w:r>
+              <w:rPr>
+                <w:sz w:val="26"/>
+                <w:szCs w:val="26"/>
+              </w:rPr>
+              <w:t>Màu</w:t>
+            </w:r>
+            <w:bookmarkStart w:id="0" w:name="_GoBack"/>
+            <w:bookmarkEnd w:id="0"/>
+            <w:r>
+              <w:rPr>
+                <w:sz w:val="26"/>
+                <w:szCs w:val="26"/>
+              </w:rPr>
+              <w:t xml:space="preserve"> 64x64</w:t>
             </w:r>
           </w:p>
         </w:tc>
@@ -1844,25 +1860,19 @@
     </w:p>
     <w:p>
       <w:pPr>
-        <w:spacing w:after="40"/>
+        <w:pStyle w:val="NormalWeb"/>
         <w:jc w:val="center"/>
-        <w:rPr>
-          <w:sz w:val="26"/>
-          <w:szCs w:val="26"/>
-        </w:rPr>
       </w:pPr>
       <w:r>
         <w:rPr>
           <w:noProof/>
-          <w:sz w:val="26"/>
-          <w:szCs w:val="26"/>
         </w:rPr>
         <w:lastRenderedPageBreak/>
         <w:drawing>
           <wp:inline distT="0" distB="0" distL="0" distR="0">
-            <wp:extent cx="1234440" cy="1234440"/>
+            <wp:extent cx="1092200" cy="1092200"/>
             <wp:effectExtent l="0" t="0" r="0" b="0"/>
-            <wp:docPr id="2" name="Picture 2"/>
+            <wp:docPr id="19" name="Picture 19" descr="D:\zynq-2d-fft-project-2d-fft-vivado\data\demo_fft_tests\input\synthetic_checker_64x64.png"/>
             <wp:cNvGraphicFramePr>
               <a:graphicFrameLocks xmlns:a="http://schemas.openxmlformats.org/drawingml/2006/main" noChangeAspect="1"/>
             </wp:cNvGraphicFramePr>
@@ -1870,23 +1880,36 @@
               <a:graphicData uri="http://schemas.openxmlformats.org/drawingml/2006/picture">
                 <pic:pic xmlns:pic="http://schemas.openxmlformats.org/drawingml/2006/picture">
                   <pic:nvPicPr>
-                    <pic:cNvPr id="0" name="image2.png"/>
-                    <pic:cNvPicPr/>
+                    <pic:cNvPr id="0" name="Picture 1" descr="D:\zynq-2d-fft-project-2d-fft-vivado\data\demo_fft_tests\input\synthetic_checker_64x64.png"/>
+                    <pic:cNvPicPr>
+                      <a:picLocks noChangeAspect="1" noChangeArrowheads="1"/>
+                    </pic:cNvPicPr>
                   </pic:nvPicPr>
                   <pic:blipFill>
-                    <a:blip r:embed="rId9"/>
+                    <a:blip r:embed="rId9">
+                      <a:extLst>
+                        <a:ext uri="{28A0092B-C50C-407E-A947-70E740481C1C}">
+                          <a14:useLocalDpi xmlns:a14="http://schemas.microsoft.com/office/drawing/2010/main" val="0"/>
+                        </a:ext>
+                      </a:extLst>
+                    </a:blip>
+                    <a:srcRect/>
                     <a:stretch>
                       <a:fillRect/>
                     </a:stretch>
                   </pic:blipFill>
-                  <pic:spPr>
+                  <pic:spPr bwMode="auto">
                     <a:xfrm>
                       <a:off x="0" y="0"/>
-                      <a:ext cx="1234440" cy="1234440"/>
+                      <a:ext cx="1092200" cy="1092200"/>
                     </a:xfrm>
                     <a:prstGeom prst="rect">
                       <a:avLst/>
                     </a:prstGeom>
+                    <a:noFill/>
+                    <a:ln>
+                      <a:noFill/>
+                    </a:ln>
                   </pic:spPr>
                 </pic:pic>
               </a:graphicData>
@@ -1931,96 +1954,6 @@
           <w:szCs w:val="26"/>
         </w:rPr>
         <w:t>Nhận xét: Ảnh checker là dữ liệu nhị phân có biên thay đổi nhanh, phù hợp để kiểm tra phản ứng của thuật toán với thành phần tần số cao. Đây là ảnh đầu vào trực quan, còn dữ liệu đưa vào testbench là ma trận pixel tương ứng.</w:t>
-      </w:r>
-    </w:p>
-    <w:p>
-      <w:pPr>
-        <w:spacing w:after="40"/>
-        <w:jc w:val="center"/>
-        <w:rPr>
-          <w:sz w:val="26"/>
-          <w:szCs w:val="26"/>
-        </w:rPr>
-      </w:pPr>
-      <w:r>
-        <w:rPr>
-          <w:noProof/>
-          <w:sz w:val="26"/>
-          <w:szCs w:val="26"/>
-        </w:rPr>
-        <w:drawing>
-          <wp:inline distT="0" distB="0" distL="0" distR="0">
-            <wp:extent cx="1234440" cy="1234440"/>
-            <wp:effectExtent l="0" t="0" r="0" b="0"/>
-            <wp:docPr id="3" name="Picture 3"/>
-            <wp:cNvGraphicFramePr>
-              <a:graphicFrameLocks xmlns:a="http://schemas.openxmlformats.org/drawingml/2006/main" noChangeAspect="1"/>
-            </wp:cNvGraphicFramePr>
-            <a:graphic xmlns:a="http://schemas.openxmlformats.org/drawingml/2006/main">
-              <a:graphicData uri="http://schemas.openxmlformats.org/drawingml/2006/picture">
-                <pic:pic xmlns:pic="http://schemas.openxmlformats.org/drawingml/2006/picture">
-                  <pic:nvPicPr>
-                    <pic:cNvPr id="0" name="image3.png"/>
-                    <pic:cNvPicPr/>
-                  </pic:nvPicPr>
-                  <pic:blipFill>
-                    <a:blip r:embed="rId10"/>
-                    <a:stretch>
-                      <a:fillRect/>
-                    </a:stretch>
-                  </pic:blipFill>
-                  <pic:spPr>
-                    <a:xfrm>
-                      <a:off x="0" y="0"/>
-                      <a:ext cx="1234440" cy="1234440"/>
-                    </a:xfrm>
-                    <a:prstGeom prst="rect">
-                      <a:avLst/>
-                    </a:prstGeom>
-                  </pic:spPr>
-                </pic:pic>
-              </a:graphicData>
-            </a:graphic>
-          </wp:inline>
-        </w:drawing>
-      </w:r>
-    </w:p>
-    <w:p>
-      <w:pPr>
-        <w:spacing w:before="80" w:after="40"/>
-        <w:jc w:val="center"/>
-        <w:rPr>
-          <w:sz w:val="26"/>
-          <w:szCs w:val="26"/>
-        </w:rPr>
-      </w:pPr>
-      <w:r>
-        <w:rPr>
-          <w:b/>
-          <w:color w:val="1F4D78"/>
-          <w:sz w:val="26"/>
-          <w:szCs w:val="26"/>
-        </w:rPr>
-        <w:t>Hình 3. Ảnh phổ FFT magnitude của mẫu checker</w:t>
-      </w:r>
-    </w:p>
-    <w:p>
-      <w:pPr>
-        <w:spacing w:after="160"/>
-        <w:ind w:left="216" w:right="216"/>
-        <w:rPr>
-          <w:sz w:val="26"/>
-          <w:szCs w:val="26"/>
-        </w:rPr>
-      </w:pPr>
-      <w:r>
-        <w:rPr>
-          <w:i/>
-          <w:color w:val="444444"/>
-          <w:sz w:val="26"/>
-          <w:szCs w:val="26"/>
-        </w:rPr>
-        <w:t>Nhận xét: Ảnh phổ cho thấy dữ liệu đã được biến đổi sang miền tần số. Hình này dùng để quan sát trực quan; khi so sánh định lượng, nhóm dùng raw FFT real/imag không shift/log để tránh sai lệch do bước hiển thị.</w:t>
       </w:r>
     </w:p>
     <w:p>
@@ -2141,7 +2074,6 @@
           <w:sz w:val="26"/>
           <w:szCs w:val="26"/>
         </w:rPr>
-        <w:lastRenderedPageBreak/>
         <w:t>4. Kết quả kiểm chứng hiện tại</w:t>
       </w:r>
     </w:p>
@@ -2674,6 +2606,7 @@
                 <w:sz w:val="26"/>
                 <w:szCs w:val="26"/>
               </w:rPr>
+              <w:lastRenderedPageBreak/>
               <w:t>HLS synthesis</w:t>
             </w:r>
           </w:p>
@@ -2895,8 +2828,6 @@
         </w:rPr>
         <w:br w:type="page"/>
       </w:r>
-      <w:bookmarkStart w:id="0" w:name="_GoBack"/>
-      <w:bookmarkEnd w:id="0"/>
     </w:p>
     <w:p>
       <w:pPr>
@@ -2910,15 +2841,13 @@
       <w:r>
         <w:rPr>
           <w:noProof/>
-          <w:sz w:val="26"/>
-          <w:szCs w:val="26"/>
         </w:rPr>
         <w:lastRenderedPageBreak/>
         <w:drawing>
-          <wp:inline distT="0" distB="0" distL="0" distR="0">
-            <wp:extent cx="5943600" cy="1035757"/>
+          <wp:inline distT="0" distB="0" distL="0" distR="0" wp14:anchorId="71F0990D" wp14:editId="5A2B2831">
+            <wp:extent cx="5943600" cy="1113790"/>
             <wp:effectExtent l="0" t="0" r="0" b="0"/>
-            <wp:docPr id="4" name="Picture 4"/>
+            <wp:docPr id="18" name="Picture 18"/>
             <wp:cNvGraphicFramePr>
               <a:graphicFrameLocks xmlns:a="http://schemas.openxmlformats.org/drawingml/2006/main" noChangeAspect="1"/>
             </wp:cNvGraphicFramePr>
@@ -2926,11 +2855,11 @@
               <a:graphicData uri="http://schemas.openxmlformats.org/drawingml/2006/picture">
                 <pic:pic xmlns:pic="http://schemas.openxmlformats.org/drawingml/2006/picture">
                   <pic:nvPicPr>
-                    <pic:cNvPr id="0" name="image4.png"/>
+                    <pic:cNvPr id="1" name=""/>
                     <pic:cNvPicPr/>
                   </pic:nvPicPr>
                   <pic:blipFill>
-                    <a:blip r:embed="rId11"/>
+                    <a:blip r:embed="rId10"/>
                     <a:stretch>
                       <a:fillRect/>
                     </a:stretch>
@@ -2938,7 +2867,7 @@
                   <pic:spPr>
                     <a:xfrm>
                       <a:off x="0" y="0"/>
-                      <a:ext cx="5943600" cy="1035757"/>
+                      <a:ext cx="5943600" cy="1113790"/>
                     </a:xfrm>
                     <a:prstGeom prst="rect">
                       <a:avLst/>
@@ -2972,25 +2901,6 @@
     </w:p>
     <w:p>
       <w:pPr>
-        <w:spacing w:after="160"/>
-        <w:ind w:left="216" w:right="216"/>
-        <w:rPr>
-          <w:sz w:val="26"/>
-          <w:szCs w:val="26"/>
-        </w:rPr>
-      </w:pPr>
-      <w:r>
-        <w:rPr>
-          <w:i/>
-          <w:color w:val="444444"/>
-          <w:sz w:val="26"/>
-          <w:szCs w:val="26"/>
-        </w:rPr>
-        <w:t>Nhận xét: Ảnh chụp cho thấy thiết kế ban đầu đạt clock estimate 7.300 ns nhưng dùng tài nguyên cao, đặc biệt DSP khoảng 186 khối. Nguyên nhân chính là việc để HLS tổng hợp sin/cos runtime cho hệ số twiddle, làm phần nhân/tính toán lượng giác chiếm nhiều DSP.</w:t>
-      </w:r>
-    </w:p>
-    <w:p>
-      <w:pPr>
         <w:spacing w:after="40"/>
         <w:jc w:val="center"/>
         <w:rPr>
@@ -2998,48 +2908,6 @@
           <w:szCs w:val="26"/>
         </w:rPr>
       </w:pPr>
-      <w:r>
-        <w:rPr>
-          <w:noProof/>
-          <w:sz w:val="26"/>
-          <w:szCs w:val="26"/>
-        </w:rPr>
-        <w:drawing>
-          <wp:inline distT="0" distB="0" distL="0" distR="0">
-            <wp:extent cx="3108960" cy="1955372"/>
-            <wp:effectExtent l="0" t="0" r="0" b="0"/>
-            <wp:docPr id="5" name="Picture 5"/>
-            <wp:cNvGraphicFramePr>
-              <a:graphicFrameLocks xmlns:a="http://schemas.openxmlformats.org/drawingml/2006/main" noChangeAspect="1"/>
-            </wp:cNvGraphicFramePr>
-            <a:graphic xmlns:a="http://schemas.openxmlformats.org/drawingml/2006/main">
-              <a:graphicData uri="http://schemas.openxmlformats.org/drawingml/2006/picture">
-                <pic:pic xmlns:pic="http://schemas.openxmlformats.org/drawingml/2006/picture">
-                  <pic:nvPicPr>
-                    <pic:cNvPr id="0" name="image5.png"/>
-                    <pic:cNvPicPr/>
-                  </pic:nvPicPr>
-                  <pic:blipFill>
-                    <a:blip r:embed="rId12"/>
-                    <a:stretch>
-                      <a:fillRect/>
-                    </a:stretch>
-                  </pic:blipFill>
-                  <pic:spPr>
-                    <a:xfrm>
-                      <a:off x="0" y="0"/>
-                      <a:ext cx="3108960" cy="1955372"/>
-                    </a:xfrm>
-                    <a:prstGeom prst="rect">
-                      <a:avLst/>
-                    </a:prstGeom>
-                  </pic:spPr>
-                </pic:pic>
-              </a:graphicData>
-            </a:graphic>
-          </wp:inline>
-        </w:drawing>
-      </w:r>
     </w:p>
     <w:p>
       <w:pPr>
@@ -3058,25 +2926,6 @@
           <w:szCs w:val="26"/>
         </w:rPr>
         <w:t>Hình 5. Bảng tài nguyên phiên bản trước tối ưu</w:t>
-      </w:r>
-    </w:p>
-    <w:p>
-      <w:pPr>
-        <w:spacing w:after="160"/>
-        <w:ind w:left="216" w:right="216"/>
-        <w:rPr>
-          <w:sz w:val="26"/>
-          <w:szCs w:val="26"/>
-        </w:rPr>
-      </w:pPr>
-      <w:r>
-        <w:rPr>
-          <w:i/>
-          <w:color w:val="444444"/>
-          <w:sz w:val="26"/>
-          <w:szCs w:val="26"/>
-        </w:rPr>
-        <w:t>Nhận xét: Bảng minh họa mức sử dụng tài nguyên ban đầu: 42 BRAM_18K, 186 DSP, 20509 FF và 29674 LUT. Đây là cơ sở để nhóm xác định cần tối ưu hệ số twiddle trước khi tiếp tục tích hợp hệ thống.</w:t>
       </w:r>
     </w:p>
     <w:p>
@@ -4064,14 +3913,12 @@
       <w:r>
         <w:rPr>
           <w:noProof/>
-          <w:sz w:val="26"/>
-          <w:szCs w:val="26"/>
         </w:rPr>
         <w:drawing>
-          <wp:inline distT="0" distB="0" distL="0" distR="0">
-            <wp:extent cx="5943600" cy="1724568"/>
+          <wp:inline distT="0" distB="0" distL="0" distR="0" wp14:anchorId="2236EC02" wp14:editId="4859F6C7">
+            <wp:extent cx="5943600" cy="1640205"/>
             <wp:effectExtent l="0" t="0" r="0" b="0"/>
-            <wp:docPr id="6" name="Picture 6"/>
+            <wp:docPr id="17" name="Picture 17"/>
             <wp:cNvGraphicFramePr>
               <a:graphicFrameLocks xmlns:a="http://schemas.openxmlformats.org/drawingml/2006/main" noChangeAspect="1"/>
             </wp:cNvGraphicFramePr>
@@ -4079,11 +3926,11 @@
               <a:graphicData uri="http://schemas.openxmlformats.org/drawingml/2006/picture">
                 <pic:pic xmlns:pic="http://schemas.openxmlformats.org/drawingml/2006/picture">
                   <pic:nvPicPr>
-                    <pic:cNvPr id="0" name="image6.png"/>
+                    <pic:cNvPr id="1" name=""/>
                     <pic:cNvPicPr/>
                   </pic:nvPicPr>
                   <pic:blipFill>
-                    <a:blip r:embed="rId13"/>
+                    <a:blip r:embed="rId11"/>
                     <a:stretch>
                       <a:fillRect/>
                     </a:stretch>
@@ -4091,7 +3938,7 @@
                   <pic:spPr>
                     <a:xfrm>
                       <a:off x="0" y="0"/>
-                      <a:ext cx="5943600" cy="1724568"/>
+                      <a:ext cx="5943600" cy="1640205"/>
                     </a:xfrm>
                     <a:prstGeom prst="rect">
                       <a:avLst/>
@@ -4191,14 +4038,12 @@
       <w:r>
         <w:rPr>
           <w:noProof/>
-          <w:sz w:val="26"/>
-          <w:szCs w:val="26"/>
         </w:rPr>
         <w:drawing>
-          <wp:inline distT="0" distB="0" distL="0" distR="0" wp14:anchorId="44CBEFA3" wp14:editId="39D1CCA8">
-            <wp:extent cx="5943600" cy="2243455"/>
-            <wp:effectExtent l="0" t="0" r="0" b="4445"/>
-            <wp:docPr id="7" name="Picture 7"/>
+          <wp:inline distT="0" distB="0" distL="0" distR="0" wp14:anchorId="2EC2370F" wp14:editId="550BB648">
+            <wp:extent cx="5943600" cy="2324100"/>
+            <wp:effectExtent l="0" t="0" r="0" b="0"/>
+            <wp:docPr id="12" name="Picture 12"/>
             <wp:cNvGraphicFramePr>
               <a:graphicFrameLocks xmlns:a="http://schemas.openxmlformats.org/drawingml/2006/main" noChangeAspect="1"/>
             </wp:cNvGraphicFramePr>
@@ -4210,7 +4055,7 @@
                     <pic:cNvPicPr/>
                   </pic:nvPicPr>
                   <pic:blipFill>
-                    <a:blip r:embed="rId14"/>
+                    <a:blip r:embed="rId12"/>
                     <a:stretch>
                       <a:fillRect/>
                     </a:stretch>
@@ -4218,7 +4063,7 @@
                   <pic:spPr>
                     <a:xfrm>
                       <a:off x="0" y="0"/>
-                      <a:ext cx="5943600" cy="2243455"/>
+                      <a:ext cx="5943600" cy="2324100"/>
                     </a:xfrm>
                     <a:prstGeom prst="rect">
                       <a:avLst/>
@@ -4289,15 +4134,13 @@
       <w:r>
         <w:rPr>
           <w:noProof/>
-          <w:sz w:val="26"/>
-          <w:szCs w:val="26"/>
         </w:rPr>
         <w:lastRenderedPageBreak/>
         <w:drawing>
-          <wp:inline distT="0" distB="0" distL="0" distR="0" wp14:anchorId="04779505" wp14:editId="2BC22E8B">
-            <wp:extent cx="5943600" cy="3011805"/>
+          <wp:inline distT="0" distB="0" distL="0" distR="0" wp14:anchorId="658C6608" wp14:editId="75B102FC">
+            <wp:extent cx="5943600" cy="3585845"/>
             <wp:effectExtent l="0" t="0" r="0" b="0"/>
-            <wp:docPr id="8" name="Picture 8"/>
+            <wp:docPr id="14" name="Picture 14"/>
             <wp:cNvGraphicFramePr>
               <a:graphicFrameLocks xmlns:a="http://schemas.openxmlformats.org/drawingml/2006/main" noChangeAspect="1"/>
             </wp:cNvGraphicFramePr>
@@ -4309,7 +4152,7 @@
                     <pic:cNvPicPr/>
                   </pic:nvPicPr>
                   <pic:blipFill>
-                    <a:blip r:embed="rId15"/>
+                    <a:blip r:embed="rId13"/>
                     <a:stretch>
                       <a:fillRect/>
                     </a:stretch>
@@ -4317,7 +4160,7 @@
                   <pic:spPr>
                     <a:xfrm>
                       <a:off x="0" y="0"/>
-                      <a:ext cx="5943600" cy="3011805"/>
+                      <a:ext cx="5943600" cy="3585845"/>
                     </a:xfrm>
                     <a:prstGeom prst="rect">
                       <a:avLst/>
@@ -4386,14 +4229,12 @@
       <w:r>
         <w:rPr>
           <w:noProof/>
-          <w:sz w:val="26"/>
-          <w:szCs w:val="26"/>
         </w:rPr>
         <w:drawing>
-          <wp:inline distT="0" distB="0" distL="0" distR="0" wp14:anchorId="22BAF3E1" wp14:editId="16CFDE53">
-            <wp:extent cx="5943600" cy="1528445"/>
+          <wp:inline distT="0" distB="0" distL="0" distR="0" wp14:anchorId="67E4B053" wp14:editId="004582D4">
+            <wp:extent cx="5943600" cy="1410335"/>
             <wp:effectExtent l="0" t="0" r="0" b="0"/>
-            <wp:docPr id="9" name="Picture 9"/>
+            <wp:docPr id="13" name="Picture 13"/>
             <wp:cNvGraphicFramePr>
               <a:graphicFrameLocks xmlns:a="http://schemas.openxmlformats.org/drawingml/2006/main" noChangeAspect="1"/>
             </wp:cNvGraphicFramePr>
@@ -4405,7 +4246,7 @@
                     <pic:cNvPicPr/>
                   </pic:nvPicPr>
                   <pic:blipFill>
-                    <a:blip r:embed="rId16"/>
+                    <a:blip r:embed="rId14"/>
                     <a:stretch>
                       <a:fillRect/>
                     </a:stretch>
@@ -4413,7 +4254,7 @@
                   <pic:spPr>
                     <a:xfrm>
                       <a:off x="0" y="0"/>
-                      <a:ext cx="5943600" cy="1528445"/>
+                      <a:ext cx="5943600" cy="1410335"/>
                     </a:xfrm>
                     <a:prstGeom prst="rect">
                       <a:avLst/>
@@ -4482,14 +4323,12 @@
       <w:r>
         <w:rPr>
           <w:noProof/>
-          <w:sz w:val="26"/>
-          <w:szCs w:val="26"/>
         </w:rPr>
         <w:drawing>
-          <wp:inline distT="0" distB="0" distL="0" distR="0" wp14:anchorId="5E71D1CA" wp14:editId="11461916">
-            <wp:extent cx="5943600" cy="848995"/>
+          <wp:inline distT="0" distB="0" distL="0" distR="0" wp14:anchorId="23B70A90" wp14:editId="4317BB54">
+            <wp:extent cx="5943600" cy="639445"/>
             <wp:effectExtent l="0" t="0" r="0" b="8255"/>
-            <wp:docPr id="10" name="Picture 10"/>
+            <wp:docPr id="15" name="Picture 15"/>
             <wp:cNvGraphicFramePr>
               <a:graphicFrameLocks xmlns:a="http://schemas.openxmlformats.org/drawingml/2006/main" noChangeAspect="1"/>
             </wp:cNvGraphicFramePr>
@@ -4501,7 +4340,7 @@
                     <pic:cNvPicPr/>
                   </pic:nvPicPr>
                   <pic:blipFill>
-                    <a:blip r:embed="rId17"/>
+                    <a:blip r:embed="rId15"/>
                     <a:stretch>
                       <a:fillRect/>
                     </a:stretch>
@@ -4509,7 +4348,7 @@
                   <pic:spPr>
                     <a:xfrm>
                       <a:off x="0" y="0"/>
-                      <a:ext cx="5943600" cy="848995"/>
+                      <a:ext cx="5943600" cy="639445"/>
                     </a:xfrm>
                     <a:prstGeom prst="rect">
                       <a:avLst/>
@@ -4538,6 +4377,7 @@
           <w:sz w:val="26"/>
           <w:szCs w:val="26"/>
         </w:rPr>
+        <w:lastRenderedPageBreak/>
         <w:t>Hình 10. Utilization hierarchy của thiết kế Vivado</w:t>
       </w:r>
     </w:p>
@@ -4557,7 +4397,6 @@
           <w:sz w:val="26"/>
           <w:szCs w:val="26"/>
         </w:rPr>
-        <w:lastRenderedPageBreak/>
         <w:t>Nhận xét: Utilization theo phân cấp cho thấy tài nguyên của toàn hệ thống sau Vivado. Số LUT/FF có thể khác HLS vì Vivado tối ưu và ánh xạ lại logic ở mức thiết kế tổng.</w:t>
       </w:r>
     </w:p>
@@ -5640,8 +5479,8 @@
       </w:r>
     </w:p>
     <w:sectPr>
-      <w:headerReference w:type="default" r:id="rId18"/>
-      <w:footerReference w:type="default" r:id="rId19"/>
+      <w:headerReference w:type="default" r:id="rId16"/>
+      <w:footerReference w:type="default" r:id="rId17"/>
       <w:pgSz w:w="12240" w:h="15840"/>
       <w:pgMar w:top="1440" w:right="1440" w:bottom="1440" w:left="1440" w:header="708" w:footer="708" w:gutter="0"/>
       <w:cols w:space="720"/>
@@ -17316,6 +17155,21 @@
       </w:tcPr>
     </w:tblStylePr>
   </w:style>
+  <w:style w:type="paragraph" w:styleId="NormalWeb">
+    <w:name w:val="Normal (Web)"/>
+    <w:basedOn w:val="Normal"/>
+    <w:uiPriority w:val="99"/>
+    <w:unhideWhenUsed/>
+    <w:rsid w:val="00463CF7"/>
+    <w:pPr>
+      <w:spacing w:before="100" w:beforeAutospacing="1" w:after="100" w:afterAutospacing="1" w:line="240" w:lineRule="auto"/>
+    </w:pPr>
+    <w:rPr>
+      <w:rFonts w:ascii="Times New Roman" w:eastAsia="Times New Roman" w:hAnsi="Times New Roman" w:cs="Times New Roman"/>
+      <w:sz w:val="24"/>
+      <w:szCs w:val="24"/>
+    </w:rPr>
+  </w:style>
 </w:styles>
 </file>
 
@@ -17644,7 +17498,7 @@
 </file>
 
 <file path=customXml/itemProps1.xml><?xml version="1.0" encoding="utf-8"?>
-<ds:datastoreItem xmlns:ds="http://schemas.openxmlformats.org/officeDocument/2006/customXml" ds:itemID="{C58AE23A-A156-4FC0-A422-A3B550C29B8F}">
+<ds:datastoreItem xmlns:ds="http://schemas.openxmlformats.org/officeDocument/2006/customXml" ds:itemID="{66562BA8-0C3D-455B-A8BF-23CD78D97FD8}">
   <ds:schemaRefs>
     <ds:schemaRef ds:uri="http://schemas.openxmlformats.org/officeDocument/2006/bibliography"/>
   </ds:schemaRefs>

</xml_diff>